<commit_message>
SAD: close open issue 1 - score shown immediately, review after exam end time
</commit_message>
<xml_diff>
--- a/SAD_Online_Exam_Portal_v1.2.docx
+++ b/SAD_Online_Exam_Portal_v1.2.docx
@@ -1065,7 +1065,7 @@
                 <w:sz w:val="17"/>
                 <w:szCs w:val="17"/>
               </w:rPr>
-              <w:t>Added Section 4 Design: 3 UML sequence diagrams (UC-02, UC-09, UC-10), API design (catalogue + 4 detailed endpoints), error handling, logging &amp; monitoring, UX design, design traceability, open issues</w:t>
+              <w:t>Added Section 4 Design: 3 UML sequence diagrams (UC-02, UC-09, UC-10), API design (catalogue + 4 detailed endpoints), error handling, logging &amp; monitoring, UX design, design traceability, open issues; result release policy agreed (score immediately, review after exam end)</w:t>
             </w:r>
           </w:p>
         </w:tc>
@@ -9120,7 +9120,7 @@
               <w:rPr>
                 <w:sz w:val="18"/>
               </w:rPr>
-              <w:t>_id, title, durationMin, startAt, endAt, passMark, questionIds[], shuffle, negativeMark, status, locked, resultsReleased</w:t>
+              <w:t>_id, title, durationMin, startAt, endAt, passMark, questionIds[], shuffle, negativeMark, status, locked, reviewEnabled</w:t>
             </w:r>
           </w:p>
         </w:tc>
@@ -9764,7 +9764,7 @@
       <w:r>
         <w:drawing>
           <wp:inline xmlns:a="http://schemas.openxmlformats.org/drawingml/2006/main" xmlns:pic="http://schemas.openxmlformats.org/drawingml/2006/picture">
-            <wp:extent cx="6400800" cy="5078186"/>
+            <wp:extent cx="6400800" cy="4392386"/>
             <wp:docPr id="1292131525" name="Picture 1292131525"/>
             <wp:cNvGraphicFramePr>
               <a:graphicFrameLocks noChangeAspect="1"/>
@@ -9785,7 +9785,7 @@
                   <pic:spPr>
                     <a:xfrm>
                       <a:off x="0" y="0"/>
-                      <a:ext cx="6400800" cy="5078186"/>
+                      <a:ext cx="6400800" cy="4392386"/>
                     </a:xfrm>
                     <a:prstGeom prst="rect"/>
                   </pic:spPr>
@@ -9865,7 +9865,20 @@
       </w:pPr>
       <w:r>
         <w:rPr/>
-        <w:t>Evaluation runs synchronously inside the submit request (MCQ scoring is O(number of questions)), keeping score availability under 5 s (NFR-OE-003). Notifications are sent asynchronously so SMTP latency never delays the response.</w:t>
+        <w:t>Result release policy: the score and pass/fail are returned in the submit response; correct answers stay on the server until the exam end time has passed, so no student can leak them to others still writing (SEC-OE-007).</w:t>
+      </w:r>
+    </w:p>
+    <w:p>
+      <w:pPr>
+        <w:pStyle w:val="ListParagraph"/>
+        <w:numPr>
+          <w:ilvl w:val="0"/>
+          <w:numId w:val="2"/>
+        </w:numPr>
+      </w:pPr>
+      <w:r>
+        <w:rPr/>
+        <w:t>Evaluation runs synchronously inside the submit request (MCQ scoring is O(number of questions)), so the score and pass/fail are shown immediately, within 5 s (NFR-OE-003). Notifications are sent asynchronously so SMTP latency never delays the response.</w:t>
       </w:r>
     </w:p>
     <w:p>
@@ -11474,7 +11487,7 @@
               <w:rPr>
                 <w:sz w:val="18"/>
               </w:rPr>
-              <w:t>Own score and review</w:t>
+              <w:t>Own score; question-wise review only after exam end time</w:t>
             </w:r>
           </w:p>
         </w:tc>
@@ -13470,7 +13483,7 @@
                 <w:rFonts w:ascii="Consolas" w:hAnsi="Consolas" w:eastAsia="Consolas"/>
                 <w:sz w:val="16"/>
               </w:rPr>
-              <w:t xml:space="preserve">  "resultReleased": true,</w:t>
+              <w:t xml:space="preserve">  "score": 34, "maxScore": 40, "passed": true,</w:t>
               <w:br/>
             </w:r>
             <w:r>
@@ -13478,7 +13491,7 @@
                 <w:rFonts w:ascii="Consolas" w:hAnsi="Consolas" w:eastAsia="Consolas"/>
                 <w:sz w:val="16"/>
               </w:rPr>
-              <w:t xml:space="preserve">  "score": 34, "maxScore": 40, "passed": true   // only if resultReleased</w:t>
+              <w:t xml:space="preserve">  "reviewAvailableAt": "2026-10-10T06:00:00Z"   // = exam endAt</w:t>
               <w:br/>
             </w:r>
             <w:r>
@@ -13583,7 +13596,7 @@
               <w:rPr>
                 <w:sz w:val="18"/>
               </w:rPr>
-              <w:t>Attempt status -&gt; SUBMITTED, score computed, audit ATTEMPT_SUBMITTED, result notification queued if released.</w:t>
+              <w:t>Attempt status -&gt; SUBMITTED, score computed, audit ATTEMPT_SUBMITTED, result notification queued (FR-OE-026).</w:t>
             </w:r>
           </w:p>
         </w:tc>
@@ -16509,7 +16522,7 @@
               <w:rPr>
                 <w:sz w:val="18"/>
               </w:rPr>
-              <w:t>Score, pass/fail badge, and question-wise review only if enabled by the Instructor.</w:t>
+              <w:t>Score and pass/fail badge shown immediately after submit. Question-wise review with correct answers unlocks after the exam end time, only if enabled by the Instructor; before that the page shows "Review available at &lt;time&gt;".</w:t>
             </w:r>
           </w:p>
         </w:tc>
@@ -16526,7 +16539,7 @@
               <w:rPr>
                 <w:sz w:val="18"/>
               </w:rPr>
-              <w:t>FR-OE-023</w:t>
+              <w:t>FR-OE-023, SEC-OE-007</w:t>
             </w:r>
           </w:p>
         </w:tc>
@@ -18145,7 +18158,7 @@
               <w:rPr>
                 <w:sz w:val="18"/>
               </w:rPr>
-              <w:t>Confirm whether results are released immediately or manually by the Instructor (affects SD-03 notification and API-15 response).</w:t>
+              <w:t>RESOLVED (05-10-2026): score and pass/fail are shown immediately after submit; question-wise review with correct answers is available only after the exam end time. Reflected in SD-03, API-15, API-16 and 4.5; SRS update by P1.</w:t>
             </w:r>
           </w:p>
         </w:tc>
@@ -18162,7 +18175,7 @@
               <w:rPr>
                 <w:sz w:val="18"/>
               </w:rPr>
-              <w:t>Open issue</w:t>
+              <w:t>Closed</w:t>
             </w:r>
           </w:p>
         </w:tc>

</xml_diff>